<commit_message>
Update of Pred Prey
</commit_message>
<xml_diff>
--- a/01_Predator_Prey/Maths_in_the_Wild_Predator_PreyWorksheet.docx
+++ b/01_Predator_Prey/Maths_in_the_Wild_Predator_PreyWorksheet.docx
@@ -250,7 +250,7 @@
                     <pic:cNvPicPr/>
                   </pic:nvPicPr>
                   <pic:blipFill>
-                    <a:blip r:embed="rId7" cstate="print">
+                    <a:blip r:embed="rId8" cstate="print">
                       <a:extLst>
                         <a:ext uri="{28A0092B-C50C-407E-A947-70E740481C1C}">
                           <a14:useLocalDpi xmlns:a14="http://schemas.microsoft.com/office/drawing/2010/main" val="0"/>
@@ -330,7 +330,7 @@
                     </pic:cNvPicPr>
                   </pic:nvPicPr>
                   <pic:blipFill rotWithShape="1">
-                    <a:blip r:embed="rId8" cstate="print">
+                    <a:blip r:embed="rId9" cstate="print">
                       <a:extLst>
                         <a:ext uri="{28A0092B-C50C-407E-A947-70E740481C1C}">
                           <a14:useLocalDpi xmlns:a14="http://schemas.microsoft.com/office/drawing/2010/main" val="0"/>
@@ -373,9 +373,9 @@
           <w:szCs w:val="40"/>
         </w:rPr>
         <w:drawing>
-          <wp:inline distT="0" distB="0" distL="0" distR="0" wp14:anchorId="2F800F96" wp14:editId="0B7CF0BE">
-            <wp:extent cx="1281843" cy="1033319"/>
-            <wp:effectExtent l="0" t="0" r="1270" b="0"/>
+          <wp:inline distT="0" distB="0" distL="0" distR="0" wp14:anchorId="2F800F96" wp14:editId="33BA7234">
+            <wp:extent cx="1062355" cy="981075"/>
+            <wp:effectExtent l="0" t="0" r="4445" b="9525"/>
             <wp:docPr id="1415604869" name="Picture 6" descr="A screenshot of a diagram&#10;&#10;Description automatically generated"/>
             <wp:cNvGraphicFramePr>
               <a:graphicFrameLocks xmlns:a="http://schemas.openxmlformats.org/drawingml/2006/main" noChangeAspect="1"/>
@@ -388,20 +388,22 @@
                     <pic:cNvPicPr/>
                   </pic:nvPicPr>
                   <pic:blipFill rotWithShape="1">
-                    <a:blip r:embed="rId9" cstate="print">
+                    <a:blip r:embed="rId10" cstate="print">
                       <a:extLst>
                         <a:ext uri="{28A0092B-C50C-407E-A947-70E740481C1C}">
                           <a14:useLocalDpi xmlns:a14="http://schemas.microsoft.com/office/drawing/2010/main" val="0"/>
                         </a:ext>
                       </a:extLst>
                     </a:blip>
-                    <a:srcRect l="23204" t="28694" r="48018" b="53381"/>
-                    <a:stretch/>
+                    <a:srcRect l="28124" t="28694" r="48018" b="54281"/>
+                    <a:stretch>
+                      <a:fillRect/>
+                    </a:stretch>
                   </pic:blipFill>
                   <pic:spPr bwMode="auto">
                     <a:xfrm>
                       <a:off x="0" y="0"/>
-                      <a:ext cx="1299743" cy="1047748"/>
+                      <a:ext cx="1077537" cy="995096"/>
                     </a:xfrm>
                     <a:prstGeom prst="rect">
                       <a:avLst/>
@@ -807,7 +809,7 @@
                     <pic:cNvPicPr/>
                   </pic:nvPicPr>
                   <pic:blipFill>
-                    <a:blip r:embed="rId10" cstate="print">
+                    <a:blip r:embed="rId11" cstate="print">
                       <a:extLst>
                         <a:ext uri="{28A0092B-C50C-407E-A947-70E740481C1C}">
                           <a14:useLocalDpi xmlns:a14="http://schemas.microsoft.com/office/drawing/2010/main" val="0"/>
@@ -1016,7 +1018,7 @@
                     <pic:cNvPicPr/>
                   </pic:nvPicPr>
                   <pic:blipFill rotWithShape="1">
-                    <a:blip r:embed="rId11" cstate="print">
+                    <a:blip r:embed="rId12" cstate="print">
                       <a:extLst>
                         <a:ext uri="{28A0092B-C50C-407E-A947-70E740481C1C}">
                           <a14:useLocalDpi xmlns:a14="http://schemas.microsoft.com/office/drawing/2010/main" val="0"/>
@@ -1086,7 +1088,7 @@
           <w:szCs w:val="40"/>
         </w:rPr>
         <w:drawing>
-          <wp:inline distT="0" distB="0" distL="0" distR="0" wp14:anchorId="228885DA" wp14:editId="68BC0B40">
+          <wp:inline distT="0" distB="0" distL="0" distR="0" wp14:anchorId="228885DA" wp14:editId="07F92C49">
             <wp:extent cx="4108516" cy="1839433"/>
             <wp:effectExtent l="0" t="0" r="0" b="2540"/>
             <wp:docPr id="1237898641" name="Content Placeholder 4" descr="A screenshot of a graph&#10;&#10;Description automatically generated">
@@ -1115,7 +1117,7 @@
                     </pic:cNvPicPr>
                   </pic:nvPicPr>
                   <pic:blipFill rotWithShape="1">
-                    <a:blip r:embed="rId12" cstate="print">
+                    <a:blip r:embed="rId13" cstate="print">
                       <a:extLst>
                         <a:ext uri="{28A0092B-C50C-407E-A947-70E740481C1C}">
                           <a14:useLocalDpi xmlns:a14="http://schemas.microsoft.com/office/drawing/2010/main" val="0"/>
@@ -1153,9 +1155,9 @@
           <w:szCs w:val="40"/>
         </w:rPr>
         <w:drawing>
-          <wp:inline distT="0" distB="0" distL="0" distR="0" wp14:anchorId="49F82665" wp14:editId="6FA7671A">
-            <wp:extent cx="1508768" cy="870585"/>
-            <wp:effectExtent l="0" t="0" r="2540" b="5715"/>
+          <wp:inline distT="0" distB="0" distL="0" distR="0" wp14:anchorId="49F82665" wp14:editId="658493F2">
+            <wp:extent cx="1194435" cy="870580"/>
+            <wp:effectExtent l="0" t="0" r="5715" b="6350"/>
             <wp:docPr id="308681743" name="Picture 6" descr="A screenshot of a diagram&#10;&#10;Description automatically generated"/>
             <wp:cNvGraphicFramePr>
               <a:graphicFrameLocks xmlns:a="http://schemas.openxmlformats.org/drawingml/2006/main" noChangeAspect="1"/>
@@ -1168,20 +1170,22 @@
                     <pic:cNvPicPr/>
                   </pic:nvPicPr>
                   <pic:blipFill rotWithShape="1">
-                    <a:blip r:embed="rId13" cstate="print">
+                    <a:blip r:embed="rId14" cstate="print">
                       <a:extLst>
                         <a:ext uri="{28A0092B-C50C-407E-A947-70E740481C1C}">
                           <a14:useLocalDpi xmlns:a14="http://schemas.microsoft.com/office/drawing/2010/main" val="0"/>
                         </a:ext>
                       </a:extLst>
                     </a:blip>
-                    <a:srcRect l="23020" t="51216" r="50614" b="37028"/>
-                    <a:stretch/>
+                    <a:srcRect l="28513" t="51216" r="50614" b="37028"/>
+                    <a:stretch>
+                      <a:fillRect/>
+                    </a:stretch>
                   </pic:blipFill>
                   <pic:spPr bwMode="auto">
                     <a:xfrm>
                       <a:off x="0" y="0"/>
-                      <a:ext cx="1510158" cy="871387"/>
+                      <a:ext cx="1195542" cy="871387"/>
                     </a:xfrm>
                     <a:prstGeom prst="rect">
                       <a:avLst/>
@@ -1608,7 +1612,7 @@
                     <pic:cNvPicPr/>
                   </pic:nvPicPr>
                   <pic:blipFill>
-                    <a:blip r:embed="rId14" cstate="print">
+                    <a:blip r:embed="rId15" cstate="print">
                       <a:extLst>
                         <a:ext uri="{28A0092B-C50C-407E-A947-70E740481C1C}">
                           <a14:useLocalDpi xmlns:a14="http://schemas.microsoft.com/office/drawing/2010/main" val="0"/>
@@ -1735,7 +1739,7 @@
                     <pic:cNvPicPr/>
                   </pic:nvPicPr>
                   <pic:blipFill>
-                    <a:blip r:embed="rId7" cstate="print">
+                    <a:blip r:embed="rId8" cstate="print">
                       <a:extLst>
                         <a:ext uri="{28A0092B-C50C-407E-A947-70E740481C1C}">
                           <a14:useLocalDpi xmlns:a14="http://schemas.microsoft.com/office/drawing/2010/main" val="0"/>
@@ -1809,7 +1813,7 @@
                     <pic:cNvPicPr/>
                   </pic:nvPicPr>
                   <pic:blipFill rotWithShape="1">
-                    <a:blip r:embed="rId11" cstate="print">
+                    <a:blip r:embed="rId12" cstate="print">
                       <a:extLst>
                         <a:ext uri="{28A0092B-C50C-407E-A947-70E740481C1C}">
                           <a14:useLocalDpi xmlns:a14="http://schemas.microsoft.com/office/drawing/2010/main" val="0"/>
@@ -1864,7 +1868,7 @@
           <w:szCs w:val="40"/>
         </w:rPr>
         <w:drawing>
-          <wp:inline distT="0" distB="0" distL="0" distR="0" wp14:anchorId="2A498FAE" wp14:editId="1DB2A04A">
+          <wp:inline distT="0" distB="0" distL="0" distR="0" wp14:anchorId="2A498FAE" wp14:editId="79A69D9B">
             <wp:extent cx="4541817" cy="1519310"/>
             <wp:effectExtent l="0" t="0" r="5080" b="5080"/>
             <wp:docPr id="2056138718" name="Picture 6" descr="A screenshot of a diagram&#10;&#10;Description automatically generated"/>
@@ -1879,7 +1883,7 @@
                     <pic:cNvPicPr/>
                   </pic:nvPicPr>
                   <pic:blipFill rotWithShape="1">
-                    <a:blip r:embed="rId15" cstate="print">
+                    <a:blip r:embed="rId16" cstate="print">
                       <a:extLst>
                         <a:ext uri="{28A0092B-C50C-407E-A947-70E740481C1C}">
                           <a14:useLocalDpi xmlns:a14="http://schemas.microsoft.com/office/drawing/2010/main" val="0"/>
@@ -1958,7 +1962,7 @@
                     </pic:cNvPicPr>
                   </pic:nvPicPr>
                   <pic:blipFill rotWithShape="1">
-                    <a:blip r:embed="rId16" cstate="print">
+                    <a:blip r:embed="rId17" cstate="print">
                       <a:extLst>
                         <a:ext uri="{28A0092B-C50C-407E-A947-70E740481C1C}">
                           <a14:useLocalDpi xmlns:a14="http://schemas.microsoft.com/office/drawing/2010/main" val="0"/>
@@ -2004,7 +2008,7 @@
           <w:szCs w:val="40"/>
         </w:rPr>
         <w:drawing>
-          <wp:inline distT="0" distB="0" distL="0" distR="0" wp14:anchorId="358CC812" wp14:editId="4AF114AA">
+          <wp:inline distT="0" distB="0" distL="0" distR="0" wp14:anchorId="358CC812" wp14:editId="77364FF7">
             <wp:extent cx="4380614" cy="1689972"/>
             <wp:effectExtent l="0" t="0" r="1270" b="0"/>
             <wp:docPr id="1530259331" name="Picture 7" descr="A screenshot of a graph&#10;&#10;Description automatically generated"/>
@@ -2019,7 +2023,7 @@
                     <pic:cNvPicPr/>
                   </pic:nvPicPr>
                   <pic:blipFill rotWithShape="1">
-                    <a:blip r:embed="rId17" cstate="print">
+                    <a:blip r:embed="rId18" cstate="print">
                       <a:extLst>
                         <a:ext uri="{28A0092B-C50C-407E-A947-70E740481C1C}">
                           <a14:useLocalDpi xmlns:a14="http://schemas.microsoft.com/office/drawing/2010/main" val="0"/>
@@ -2976,7 +2980,7 @@
                     <pic:cNvPicPr/>
                   </pic:nvPicPr>
                   <pic:blipFill>
-                    <a:blip r:embed="rId18" cstate="print">
+                    <a:blip r:embed="rId19" cstate="print">
                       <a:extLst>
                         <a:ext uri="{28A0092B-C50C-407E-A947-70E740481C1C}">
                           <a14:useLocalDpi xmlns:a14="http://schemas.microsoft.com/office/drawing/2010/main" val="0"/>
@@ -3034,7 +3038,7 @@
                     <pic:cNvPicPr/>
                   </pic:nvPicPr>
                   <pic:blipFill>
-                    <a:blip r:embed="rId19" cstate="print">
+                    <a:blip r:embed="rId20" cstate="print">
                       <a:extLst>
                         <a:ext uri="{28A0092B-C50C-407E-A947-70E740481C1C}">
                           <a14:useLocalDpi xmlns:a14="http://schemas.microsoft.com/office/drawing/2010/main" val="0"/>
@@ -3098,6 +3102,17 @@
           <w:szCs w:val="24"/>
         </w:rPr>
       </w:pPr>
+    </w:p>
+    <w:p>
+      <w:pPr>
+        <w:rPr>
+          <w:rStyle w:val="Heading1Char"/>
+          <w:rFonts w:asciiTheme="minorHAnsi" w:eastAsiaTheme="minorHAnsi" w:hAnsiTheme="minorHAnsi" w:cstheme="minorBidi"/>
+          <w:color w:val="auto"/>
+          <w:sz w:val="24"/>
+          <w:szCs w:val="24"/>
+        </w:rPr>
+      </w:pPr>
       <w:r>
         <w:rPr>
           <w:rStyle w:val="Heading1Char"/>
@@ -3125,7 +3140,7 @@
           <w:szCs w:val="40"/>
         </w:rPr>
         <w:drawing>
-          <wp:inline distT="0" distB="0" distL="0" distR="0" wp14:anchorId="5E6AE169" wp14:editId="608434F9">
+          <wp:inline distT="0" distB="0" distL="0" distR="0" wp14:anchorId="5E6AE169" wp14:editId="6CFB13DF">
             <wp:extent cx="4146698" cy="3387243"/>
             <wp:effectExtent l="0" t="0" r="0" b="3810"/>
             <wp:docPr id="330269408" name="Picture 5" descr="A screenshot of a diagram&#10;&#10;Description automatically generated"/>
@@ -3140,7 +3155,7 @@
                     <pic:cNvPicPr/>
                   </pic:nvPicPr>
                   <pic:blipFill rotWithShape="1">
-                    <a:blip r:embed="rId20" cstate="print">
+                    <a:blip r:embed="rId21" cstate="print">
                       <a:extLst>
                         <a:ext uri="{28A0092B-C50C-407E-A947-70E740481C1C}">
                           <a14:useLocalDpi xmlns:a14="http://schemas.microsoft.com/office/drawing/2010/main" val="0"/>
@@ -3185,6 +3200,39 @@
       <w:pPr>
         <w:rPr>
           <w:rStyle w:val="Heading1Char"/>
+          <w:sz w:val="24"/>
+          <w:szCs w:val="24"/>
+        </w:rPr>
+      </w:pPr>
+      <w:r>
+        <w:rPr>
+          <w:rStyle w:val="Heading1Char"/>
+          <w:sz w:val="24"/>
+          <w:szCs w:val="24"/>
+        </w:rPr>
+        <w:t xml:space="preserve">Describe what is happening in the </w:t>
+      </w:r>
+      <w:r>
+        <w:rPr>
+          <w:rStyle w:val="Heading1Char"/>
+          <w:sz w:val="24"/>
+          <w:szCs w:val="24"/>
+        </w:rPr>
+        <w:t>below</w:t>
+      </w:r>
+      <w:r>
+        <w:rPr>
+          <w:rStyle w:val="Heading1Char"/>
+          <w:sz w:val="24"/>
+          <w:szCs w:val="24"/>
+        </w:rPr>
+        <w:t xml:space="preserve"> graph:</w:t>
+      </w:r>
+    </w:p>
+    <w:p>
+      <w:pPr>
+        <w:rPr>
+          <w:rStyle w:val="Heading1Char"/>
         </w:rPr>
       </w:pPr>
       <w:r>
@@ -3210,7 +3258,7 @@
                     </pic:cNvPicPr>
                   </pic:nvPicPr>
                   <pic:blipFill>
-                    <a:blip r:embed="rId21">
+                    <a:blip r:embed="rId22">
                       <a:extLst>
                         <a:ext uri="{28A0092B-C50C-407E-A947-70E740481C1C}">
                           <a14:useLocalDpi xmlns:a14="http://schemas.microsoft.com/office/drawing/2010/main" val="0"/>
@@ -3248,10 +3296,405 @@
           <w:rStyle w:val="Heading1Char"/>
         </w:rPr>
       </w:pPr>
+      <w:r>
+        <w:rPr>
+          <w:rStyle w:val="Heading1Char"/>
+        </w:rPr>
+        <w:br w:type="page"/>
+      </w:r>
+    </w:p>
+    <w:p>
+      <w:pPr>
+        <w:rPr>
+          <w:rStyle w:val="Heading1Char"/>
+        </w:rPr>
+      </w:pPr>
+      <w:r>
+        <w:rPr>
+          <w:rStyle w:val="Heading1Char"/>
+        </w:rPr>
+        <w:lastRenderedPageBreak/>
+        <w:t>Discussion Questions</w:t>
+      </w:r>
+    </w:p>
+    <w:p>
+      <w:pPr>
+        <w:pStyle w:val="ListParagraph"/>
+        <w:numPr>
+          <w:ilvl w:val="0"/>
+          <w:numId w:val="1"/>
+        </w:numPr>
+        <w:rPr>
+          <w:rFonts w:ascii="Arial" w:hAnsi="Arial" w:cs="Arial"/>
+        </w:rPr>
+      </w:pPr>
+      <w:r>
+        <w:rPr>
+          <w:rFonts w:ascii="Arial" w:hAnsi="Arial" w:cs="Arial"/>
+        </w:rPr>
+        <w:t>What happened to the environment when the wolves are re-introduced?</w:t>
+      </w:r>
+    </w:p>
+    <w:p>
+      <w:pPr>
+        <w:pStyle w:val="ListParagraph"/>
+        <w:rPr>
+          <w:rFonts w:ascii="Arial" w:hAnsi="Arial" w:cs="Arial"/>
+        </w:rPr>
+      </w:pPr>
+    </w:p>
+    <w:p>
+      <w:pPr>
+        <w:rPr>
+          <w:rFonts w:ascii="Arial" w:hAnsi="Arial" w:cs="Arial"/>
+        </w:rPr>
+      </w:pPr>
+    </w:p>
+    <w:p>
+      <w:pPr>
+        <w:rPr>
+          <w:rFonts w:ascii="Arial" w:hAnsi="Arial" w:cs="Arial"/>
+        </w:rPr>
+      </w:pPr>
+    </w:p>
+    <w:p>
+      <w:pPr>
+        <w:rPr>
+          <w:rFonts w:ascii="Arial" w:hAnsi="Arial" w:cs="Arial"/>
+        </w:rPr>
+      </w:pPr>
+    </w:p>
+    <w:p>
+      <w:pPr>
+        <w:rPr>
+          <w:rFonts w:ascii="Arial" w:hAnsi="Arial" w:cs="Arial"/>
+        </w:rPr>
+      </w:pPr>
+    </w:p>
+    <w:p>
+      <w:pPr>
+        <w:rPr>
+          <w:rFonts w:ascii="Arial" w:hAnsi="Arial" w:cs="Arial"/>
+        </w:rPr>
+      </w:pPr>
+    </w:p>
+    <w:p>
+      <w:pPr>
+        <w:rPr>
+          <w:rFonts w:ascii="Arial" w:hAnsi="Arial" w:cs="Arial"/>
+        </w:rPr>
+      </w:pPr>
+    </w:p>
+    <w:p>
+      <w:pPr>
+        <w:pStyle w:val="ListParagraph"/>
+        <w:rPr>
+          <w:rFonts w:ascii="Arial" w:hAnsi="Arial" w:cs="Arial"/>
+        </w:rPr>
+      </w:pPr>
+    </w:p>
+    <w:p>
+      <w:pPr>
+        <w:pStyle w:val="ListParagraph"/>
+        <w:numPr>
+          <w:ilvl w:val="0"/>
+          <w:numId w:val="1"/>
+        </w:numPr>
+        <w:rPr>
+          <w:rFonts w:ascii="Arial" w:hAnsi="Arial" w:cs="Arial"/>
+        </w:rPr>
+      </w:pPr>
+      <w:r>
+        <w:rPr>
+          <w:rFonts w:ascii="Arial" w:hAnsi="Arial" w:cs="Arial"/>
+        </w:rPr>
+        <w:t>What happened to the wolf population when they are re-introduced?</w:t>
+      </w:r>
+    </w:p>
+    <w:p>
+      <w:pPr>
+        <w:rPr>
+          <w:rFonts w:ascii="Arial" w:hAnsi="Arial" w:cs="Arial"/>
+        </w:rPr>
+      </w:pPr>
+    </w:p>
+    <w:p>
+      <w:pPr>
+        <w:rPr>
+          <w:rFonts w:ascii="Arial" w:hAnsi="Arial" w:cs="Arial"/>
+        </w:rPr>
+      </w:pPr>
+    </w:p>
+    <w:p>
+      <w:pPr>
+        <w:rPr>
+          <w:rFonts w:ascii="Arial" w:hAnsi="Arial" w:cs="Arial"/>
+        </w:rPr>
+      </w:pPr>
+    </w:p>
+    <w:p>
+      <w:pPr>
+        <w:rPr>
+          <w:rFonts w:ascii="Arial" w:hAnsi="Arial" w:cs="Arial"/>
+        </w:rPr>
+      </w:pPr>
+    </w:p>
+    <w:p>
+      <w:pPr>
+        <w:rPr>
+          <w:rFonts w:ascii="Arial" w:hAnsi="Arial" w:cs="Arial"/>
+        </w:rPr>
+      </w:pPr>
+    </w:p>
+    <w:p>
+      <w:pPr>
+        <w:rPr>
+          <w:rFonts w:ascii="Arial" w:hAnsi="Arial" w:cs="Arial"/>
+        </w:rPr>
+      </w:pPr>
+    </w:p>
+    <w:p>
+      <w:pPr>
+        <w:rPr>
+          <w:rFonts w:ascii="Arial" w:hAnsi="Arial" w:cs="Arial"/>
+        </w:rPr>
+      </w:pPr>
+    </w:p>
+    <w:p>
+      <w:pPr>
+        <w:rPr>
+          <w:rFonts w:ascii="Arial" w:hAnsi="Arial" w:cs="Arial"/>
+        </w:rPr>
+      </w:pPr>
+    </w:p>
+    <w:p>
+      <w:pPr>
+        <w:pStyle w:val="ListParagraph"/>
+        <w:numPr>
+          <w:ilvl w:val="0"/>
+          <w:numId w:val="1"/>
+        </w:numPr>
+        <w:rPr>
+          <w:rFonts w:ascii="Arial" w:hAnsi="Arial" w:cs="Arial"/>
+        </w:rPr>
+      </w:pPr>
+      <w:r>
+        <w:rPr>
+          <w:rFonts w:ascii="Arial" w:hAnsi="Arial" w:cs="Arial"/>
+        </w:rPr>
+        <w:t>What happened to the deer population when the wolves are re-introduced?</w:t>
+      </w:r>
+    </w:p>
+    <w:p>
+      <w:pPr>
+        <w:rPr>
+          <w:rFonts w:ascii="Arial" w:hAnsi="Arial" w:cs="Arial"/>
+        </w:rPr>
+      </w:pPr>
+    </w:p>
+    <w:p>
+      <w:pPr>
+        <w:rPr>
+          <w:rFonts w:ascii="Arial" w:hAnsi="Arial" w:cs="Arial"/>
+        </w:rPr>
+      </w:pPr>
+    </w:p>
+    <w:p>
+      <w:pPr>
+        <w:rPr>
+          <w:rFonts w:ascii="Arial" w:hAnsi="Arial" w:cs="Arial"/>
+        </w:rPr>
+      </w:pPr>
+    </w:p>
+    <w:p>
+      <w:pPr>
+        <w:rPr>
+          <w:rFonts w:ascii="Arial" w:hAnsi="Arial" w:cs="Arial"/>
+        </w:rPr>
+      </w:pPr>
+    </w:p>
+    <w:p>
+      <w:pPr>
+        <w:rPr>
+          <w:rFonts w:ascii="Arial" w:hAnsi="Arial" w:cs="Arial"/>
+        </w:rPr>
+      </w:pPr>
+    </w:p>
+    <w:p>
+      <w:pPr>
+        <w:rPr>
+          <w:rFonts w:ascii="Arial" w:hAnsi="Arial" w:cs="Arial"/>
+        </w:rPr>
+      </w:pPr>
+    </w:p>
+    <w:p>
+      <w:pPr>
+        <w:rPr>
+          <w:rFonts w:ascii="Arial" w:hAnsi="Arial" w:cs="Arial"/>
+        </w:rPr>
+      </w:pPr>
+    </w:p>
+    <w:p>
+      <w:pPr>
+        <w:rPr>
+          <w:rFonts w:ascii="Arial" w:hAnsi="Arial" w:cs="Arial"/>
+        </w:rPr>
+      </w:pPr>
+    </w:p>
+    <w:p>
+      <w:pPr>
+        <w:rPr>
+          <w:rFonts w:ascii="Arial" w:hAnsi="Arial" w:cs="Arial"/>
+        </w:rPr>
+      </w:pPr>
+    </w:p>
+    <w:p>
+      <w:pPr>
+        <w:pStyle w:val="ListParagraph"/>
+        <w:numPr>
+          <w:ilvl w:val="0"/>
+          <w:numId w:val="1"/>
+        </w:numPr>
+        <w:rPr>
+          <w:rFonts w:ascii="Arial" w:hAnsi="Arial" w:cs="Arial"/>
+        </w:rPr>
+      </w:pPr>
+      <w:r>
+        <w:rPr>
+          <w:rFonts w:ascii="Arial" w:hAnsi="Arial" w:cs="Arial"/>
+        </w:rPr>
+        <w:t>Do you think the wolves should have been re-introduced</w:t>
+      </w:r>
+      <w:r>
+        <w:rPr>
+          <w:rFonts w:ascii="Arial" w:hAnsi="Arial" w:cs="Arial"/>
+        </w:rPr>
+        <w:t xml:space="preserve"> in Ireland</w:t>
+      </w:r>
+      <w:r>
+        <w:rPr>
+          <w:rFonts w:ascii="Arial" w:hAnsi="Arial" w:cs="Arial"/>
+        </w:rPr>
+        <w:t>?</w:t>
+      </w:r>
+      <w:r>
+        <w:rPr>
+          <w:rFonts w:ascii="Arial" w:hAnsi="Arial" w:cs="Arial"/>
+        </w:rPr>
+        <w:br/>
+      </w:r>
+      <w:r>
+        <w:rPr>
+          <w:rFonts w:ascii="Arial" w:hAnsi="Arial" w:cs="Arial"/>
+        </w:rPr>
+        <w:br/>
+      </w:r>
+      <w:r>
+        <w:rPr>
+          <w:rFonts w:ascii="Arial" w:hAnsi="Arial" w:cs="Arial"/>
+        </w:rPr>
+        <w:br/>
+      </w:r>
+      <w:r>
+        <w:rPr>
+          <w:rFonts w:ascii="Arial" w:hAnsi="Arial" w:cs="Arial"/>
+        </w:rPr>
+        <w:br/>
+      </w:r>
+      <w:r>
+        <w:rPr>
+          <w:rFonts w:ascii="Arial" w:hAnsi="Arial" w:cs="Arial"/>
+        </w:rPr>
+        <w:br/>
+      </w:r>
+      <w:r>
+        <w:rPr>
+          <w:rFonts w:ascii="Arial" w:hAnsi="Arial" w:cs="Arial"/>
+        </w:rPr>
+        <w:br/>
+      </w:r>
+      <w:r>
+        <w:rPr>
+          <w:rFonts w:ascii="Arial" w:hAnsi="Arial" w:cs="Arial"/>
+        </w:rPr>
+        <w:br/>
+      </w:r>
+      <w:r>
+        <w:rPr>
+          <w:rFonts w:ascii="Arial" w:hAnsi="Arial" w:cs="Arial"/>
+        </w:rPr>
+        <w:br/>
+      </w:r>
+      <w:r>
+        <w:rPr>
+          <w:rFonts w:ascii="Arial" w:hAnsi="Arial" w:cs="Arial"/>
+        </w:rPr>
+        <w:br/>
+      </w:r>
+    </w:p>
+    <w:p>
+      <w:pPr>
+        <w:pStyle w:val="ListParagraph"/>
+        <w:numPr>
+          <w:ilvl w:val="0"/>
+          <w:numId w:val="1"/>
+        </w:numPr>
+        <w:rPr>
+          <w:rFonts w:ascii="Arial" w:hAnsi="Arial" w:cs="Arial"/>
+        </w:rPr>
+      </w:pPr>
+      <w:r>
+        <w:rPr>
+          <w:rFonts w:ascii="Arial" w:hAnsi="Arial" w:cs="Arial"/>
+        </w:rPr>
+        <w:t>What else could you model with these Equations?</w:t>
+      </w:r>
+    </w:p>
+    <w:p>
+      <w:pPr>
+        <w:rPr>
+          <w:rFonts w:ascii="Arial" w:hAnsi="Arial" w:cs="Arial"/>
+        </w:rPr>
+      </w:pPr>
+    </w:p>
+    <w:p>
+      <w:pPr>
+        <w:rPr>
+          <w:rFonts w:ascii="Arial" w:hAnsi="Arial" w:cs="Arial"/>
+        </w:rPr>
+      </w:pPr>
+    </w:p>
+    <w:p>
+      <w:pPr>
+        <w:rPr>
+          <w:rFonts w:ascii="Arial" w:hAnsi="Arial" w:cs="Arial"/>
+        </w:rPr>
+      </w:pPr>
+    </w:p>
+    <w:p>
+      <w:pPr>
+        <w:rPr>
+          <w:rFonts w:ascii="Arial" w:hAnsi="Arial" w:cs="Arial"/>
+        </w:rPr>
+      </w:pPr>
+    </w:p>
+    <w:p>
+      <w:pPr>
+        <w:rPr>
+          <w:rFonts w:ascii="Arial" w:hAnsi="Arial" w:cs="Arial"/>
+        </w:rPr>
+      </w:pPr>
+    </w:p>
+    <w:p>
+      <w:pPr>
+        <w:rPr>
+          <w:rStyle w:val="Heading1Char"/>
+        </w:rPr>
+      </w:pPr>
     </w:p>
     <w:sectPr>
-      <w:headerReference w:type="default" r:id="rId22"/>
-      <w:footerReference w:type="default" r:id="rId23"/>
+      <w:headerReference w:type="default" r:id="rId23"/>
+      <w:footerReference w:type="default" r:id="rId24"/>
       <w:pgSz w:w="11900" w:h="16840"/>
       <w:pgMar w:top="1440" w:right="1440" w:bottom="1440" w:left="1440" w:header="708" w:footer="708" w:gutter="0"/>
       <w:cols w:space="708"/>
@@ -3488,6 +3931,100 @@
     </w:r>
   </w:p>
 </w:hdr>
+</file>
+
+<file path=word/numbering.xml><?xml version="1.0" encoding="utf-8"?>
+<w:numbering xmlns:wpc="http://schemas.microsoft.com/office/word/2010/wordprocessingCanvas" xmlns:cx="http://schemas.microsoft.com/office/drawing/2014/chartex" xmlns:cx1="http://schemas.microsoft.com/office/drawing/2015/9/8/chartex" xmlns:cx2="http://schemas.microsoft.com/office/drawing/2015/10/21/chartex" xmlns:cx3="http://schemas.microsoft.com/office/drawing/2016/5/9/chartex" xmlns:cx4="http://schemas.microsoft.com/office/drawing/2016/5/10/chartex" xmlns:cx5="http://schemas.microsoft.com/office/drawing/2016/5/11/chartex" xmlns:cx6="http://schemas.microsoft.com/office/drawing/2016/5/12/chartex" xmlns:cx7="http://schemas.microsoft.com/office/drawing/2016/5/13/chartex" xmlns:cx8="http://schemas.microsoft.com/office/drawing/2016/5/14/chartex" xmlns:mc="http://schemas.openxmlformats.org/markup-compatibility/2006" xmlns:aink="http://schemas.microsoft.com/office/drawing/2016/ink" xmlns:am3d="http://schemas.microsoft.com/office/drawing/2017/model3d" xmlns:o="urn:schemas-microsoft-com:office:office" xmlns:oel="http://schemas.microsoft.com/office/2019/extlst" xmlns:r="http://schemas.openxmlformats.org/officeDocument/2006/relationships" xmlns:m="http://schemas.openxmlformats.org/officeDocument/2006/math" xmlns:v="urn:schemas-microsoft-com:vml" xmlns:wp14="http://schemas.microsoft.com/office/word/2010/wordprocessingDrawing" xmlns:wp="http://schemas.openxmlformats.org/drawingml/2006/wordprocessingDrawing" xmlns:w10="urn:schemas-microsoft-com:office:word" xmlns:w="http://schemas.openxmlformats.org/wordprocessingml/2006/main" xmlns:w14="http://schemas.microsoft.com/office/word/2010/wordml" xmlns:w15="http://schemas.microsoft.com/office/word/2012/wordml" xmlns:w16cex="http://schemas.microsoft.com/office/word/2018/wordml/cex" xmlns:w16cid="http://schemas.microsoft.com/office/word/2016/wordml/cid" xmlns:w16="http://schemas.microsoft.com/office/word/2018/wordml" xmlns:w16du="http://schemas.microsoft.com/office/word/2023/wordml/word16du" xmlns:w16sdtdh="http://schemas.microsoft.com/office/word/2020/wordml/sdtdatahash" xmlns:w16sdtfl="http://schemas.microsoft.com/office/word/2024/wordml/sdtformatlock" xmlns:w16se="http://schemas.microsoft.com/office/word/2015/wordml/symex" xmlns:wpg="http://schemas.microsoft.com/office/word/2010/wordprocessingGroup" xmlns:wpi="http://schemas.microsoft.com/office/word/2010/wordprocessingInk" xmlns:wne="http://schemas.microsoft.com/office/word/2006/wordml" xmlns:wps="http://schemas.microsoft.com/office/word/2010/wordprocessingShape" mc:Ignorable="w14 w15 w16se w16cid w16 w16cex w16sdtdh w16sdtfl w16du wp14">
+  <w:abstractNum w:abstractNumId="0" w15:restartNumberingAfterBreak="0">
+    <w:nsid w:val="270351B6"/>
+    <w:multiLevelType w:val="hybridMultilevel"/>
+    <w:tmpl w:val="DCD09C70"/>
+    <w:lvl w:ilvl="0" w:tplc="0809000F">
+      <w:start w:val="1"/>
+      <w:numFmt w:val="decimal"/>
+      <w:lvlText w:val="%1."/>
+      <w:lvlJc w:val="left"/>
+      <w:pPr>
+        <w:ind w:left="720" w:hanging="360"/>
+      </w:pPr>
+    </w:lvl>
+    <w:lvl w:ilvl="1" w:tplc="08090019" w:tentative="1">
+      <w:start w:val="1"/>
+      <w:numFmt w:val="lowerLetter"/>
+      <w:lvlText w:val="%2."/>
+      <w:lvlJc w:val="left"/>
+      <w:pPr>
+        <w:ind w:left="1440" w:hanging="360"/>
+      </w:pPr>
+    </w:lvl>
+    <w:lvl w:ilvl="2" w:tplc="0809001B" w:tentative="1">
+      <w:start w:val="1"/>
+      <w:numFmt w:val="lowerRoman"/>
+      <w:lvlText w:val="%3."/>
+      <w:lvlJc w:val="right"/>
+      <w:pPr>
+        <w:ind w:left="2160" w:hanging="180"/>
+      </w:pPr>
+    </w:lvl>
+    <w:lvl w:ilvl="3" w:tplc="0809000F" w:tentative="1">
+      <w:start w:val="1"/>
+      <w:numFmt w:val="decimal"/>
+      <w:lvlText w:val="%4."/>
+      <w:lvlJc w:val="left"/>
+      <w:pPr>
+        <w:ind w:left="2880" w:hanging="360"/>
+      </w:pPr>
+    </w:lvl>
+    <w:lvl w:ilvl="4" w:tplc="08090019" w:tentative="1">
+      <w:start w:val="1"/>
+      <w:numFmt w:val="lowerLetter"/>
+      <w:lvlText w:val="%5."/>
+      <w:lvlJc w:val="left"/>
+      <w:pPr>
+        <w:ind w:left="3600" w:hanging="360"/>
+      </w:pPr>
+    </w:lvl>
+    <w:lvl w:ilvl="5" w:tplc="0809001B" w:tentative="1">
+      <w:start w:val="1"/>
+      <w:numFmt w:val="lowerRoman"/>
+      <w:lvlText w:val="%6."/>
+      <w:lvlJc w:val="right"/>
+      <w:pPr>
+        <w:ind w:left="4320" w:hanging="180"/>
+      </w:pPr>
+    </w:lvl>
+    <w:lvl w:ilvl="6" w:tplc="0809000F" w:tentative="1">
+      <w:start w:val="1"/>
+      <w:numFmt w:val="decimal"/>
+      <w:lvlText w:val="%7."/>
+      <w:lvlJc w:val="left"/>
+      <w:pPr>
+        <w:ind w:left="5040" w:hanging="360"/>
+      </w:pPr>
+    </w:lvl>
+    <w:lvl w:ilvl="7" w:tplc="08090019" w:tentative="1">
+      <w:start w:val="1"/>
+      <w:numFmt w:val="lowerLetter"/>
+      <w:lvlText w:val="%8."/>
+      <w:lvlJc w:val="left"/>
+      <w:pPr>
+        <w:ind w:left="5760" w:hanging="360"/>
+      </w:pPr>
+    </w:lvl>
+    <w:lvl w:ilvl="8" w:tplc="0809001B" w:tentative="1">
+      <w:start w:val="1"/>
+      <w:numFmt w:val="lowerRoman"/>
+      <w:lvlText w:val="%9."/>
+      <w:lvlJc w:val="right"/>
+      <w:pPr>
+        <w:ind w:left="6480" w:hanging="180"/>
+      </w:pPr>
+    </w:lvl>
+  </w:abstractNum>
+  <w:num w:numId="1" w16cid:durableId="806434593">
+    <w:abstractNumId w:val="0"/>
+  </w:num>
+</w:numbering>
 </file>
 
 <file path=word/styles.xml><?xml version="1.0" encoding="utf-8"?>

</xml_diff>